<commit_message>
docs(czechinvest): rebuild methodology PDF and DOCX from the new figures
The two A8 methodologies embed the screenshots that were just recaptured, so
both exports were regenerated from Markdown through the reproducible build
script. The IT methodology also picks up the current pinned package manager
version, which the build reads from `package.json`.

Co-Authored-By: Claude Opus 5 (1M context) <noreply@anthropic.com>
</commit_message>
<xml_diff>
--- a/docs/czechinvest/methodologies/Metodika-pro-uzivatele-Coursition.docx
+++ b/docs/czechinvest/methodologies/Metodika-pro-uzivatele-Coursition.docx
@@ -2180,7 +2180,7 @@
         <w:rPr/>
         <w:drawing>
           <wp:inline distT="0" distB="0" distL="0" distR="0">
-            <wp:extent cx="5800000" cy="12993611"/>
+            <wp:extent cx="5800000" cy="13275556"/>
             <wp:effectExtent l="0" t="0" r="0" b="0"/>
             <wp:docPr id="2" name="Image2" descr="Úvodní česká stránka Coursition s hlavní výzvou k zahájení tvorby kurzu"/>
             <wp:cNvGraphicFramePr>
@@ -2204,7 +2204,7 @@
                   <pic:spPr bwMode="auto">
                     <a:xfrm>
                       <a:off x="0" y="0"/>
-                      <a:ext cx="5800000" cy="12993611"/>
+                      <a:ext cx="5800000" cy="13275556"/>
                     </a:xfrm>
                     <a:prstGeom prst="rect">
                       <a:avLst/>

</xml_diff>